<commit_message>
docs: fill contest identity on the result report
Record the one-person team, leader, and free-task category
on both the DOCX and the matching PDF.

Co-authored-by: Seeun Park <chappse6@users.noreply.github.com>
</commit_message>
<xml_diff>
--- a/artifacts/web-picker-result-report.docx
+++ b/artifacts/web-picker-result-report.docx
@@ -460,7 +460,7 @@
                 <w:sz w:val="20"/>
                 <w:szCs w:val="20"/>
               </w:rPr>
-              <w:t>제출 전 접수정보 확인 필요</w:t>
+              <w:t>1명 (팀장 박세은)</w:t>
             </w:r>
           </w:p>
         </w:tc>
@@ -540,7 +540,7 @@
                 <w:sz w:val="20"/>
                 <w:szCs w:val="20"/>
               </w:rPr>
-              <w:t>제출 전 접수정보 확인 필요</w:t>
+              <w:t>자유과제/기타</w:t>
             </w:r>
           </w:p>
         </w:tc>
@@ -616,7 +616,7 @@
                 <w:sz w:val="20"/>
                 <w:szCs w:val="20"/>
               </w:rPr>
-              <w:t>제출 전 접수정보 확인 필요</w:t>
+              <w:t>자유과제/기타</w:t>
             </w:r>
           </w:p>
         </w:tc>

</xml_diff>

<commit_message>
docs: fill contest result report with verified public URLs
- Updated artifacts/web-picker-result-report.docx with repository and YouTube URLs
- Regenerated artifacts/web-picker-result-report.pdf from updated DOCX
- Marked URL blockers as resolved in docs/video-script.md
- Checked off URL requirements in docs/submission-checklist.md

Repository: https://github.com/chappse6/web-picker
Demo video: https://youtu.be/ZYcI42mq5YM

Co-authored-by: Seeun Park <chappse6@users.noreply.github.com>
</commit_message>
<xml_diff>
--- a/artifacts/web-picker-result-report.docx
+++ b/artifacts/web-picker-result-report.docx
@@ -865,20 +865,8 @@
             <w:vAlign w:val="top"/>
           </w:tcPr>
           <w:p>
-            <w:pPr>
-              <w:jc w:val="left"/>
-              <w:spacing w:before="0" w:after="40" w:line="276" w:lineRule="auto"/>
-            </w:pPr>
-            <w:r>
-              <w:rPr>
-                <w:rFonts w:ascii="Malgun Gothic" w:hAnsi="Malgun Gothic" w:eastAsia="맑은 고딕"/>
-                <w:b/>
-                <w:bCs/>
-                <w:color w:val="000000"/>
-                <w:sz w:val="20"/>
-                <w:szCs w:val="20"/>
-              </w:rPr>
-              <w:t>미확정 - 공개 저장소를 아직 게시하지 않음. 제출 전 실제 GitHub URL 입력 및 접속 검증 필요</w:t>
+            <w:r>
+              <w:t>https://github.com/chappse6/web-picker</w:t>
             </w:r>
           </w:p>
         </w:tc>
@@ -943,20 +931,8 @@
             <w:vAlign w:val="top"/>
           </w:tcPr>
           <w:p>
-            <w:pPr>
-              <w:jc w:val="left"/>
-              <w:spacing w:before="0" w:after="40" w:line="276" w:lineRule="auto"/>
-            </w:pPr>
-            <w:r>
-              <w:rPr>
-                <w:rFonts w:ascii="Malgun Gothic" w:hAnsi="Malgun Gothic" w:eastAsia="맑은 고딕"/>
-                <w:b/>
-                <w:bCs/>
-                <w:color w:val="000000"/>
-                <w:sz w:val="20"/>
-                <w:szCs w:val="20"/>
-              </w:rPr>
-              <w:t>미확정 - 최종 시연 영상을 아직 업로드하지 않음. 제출 전 3분 이하 YouTube URL 입력 및 재생 검증 필요</w:t>
+            <w:r>
+              <w:t>https://youtu.be/ZYcI42mq5YM</w:t>
             </w:r>
           </w:p>
         </w:tc>

</xml_diff>

<commit_message>
docs: update contest result report cover fields and rebuild PDF
- Set 팀인원 to 1, 참가부문 to 일반, 과제유형 to 자유과제
- Update GitHub URL to https://github.com/chappse6/web-picker
- Update video URL to https://youtu.be/ZYcI42mq5YM
- Regenerate PDF from updated DOCX
- No 붙임 2 AI model specification (as expected)
- SBOM (붙임 1) remains intact

Co-authored-by: Seeun Park <chappse6@users.noreply.github.com>
</commit_message>
<xml_diff>
--- a/artifacts/web-picker-result-report.docx
+++ b/artifacts/web-picker-result-report.docx
@@ -447,20 +447,8 @@
             <w:hideMark/>
           </w:tcPr>
           <w:p>
-            <w:pPr>
-              <w:jc w:val="center"/>
-              <w:spacing w:before="0" w:after="0" w:line="240" w:lineRule="auto"/>
-            </w:pPr>
-            <w:r>
-              <w:rPr>
-                <w:rFonts w:ascii="Malgun Gothic" w:hAnsi="Malgun Gothic" w:eastAsia="맑은 고딕"/>
-                <w:b/>
-                <w:bCs/>
-                <w:color w:val="000000"/>
-                <w:sz w:val="20"/>
-                <w:szCs w:val="20"/>
-              </w:rPr>
-              <w:t>제출 전 접수정보 확인 필요</w:t>
+            <w:r>
+              <w:t>1</w:t>
             </w:r>
           </w:p>
         </w:tc>
@@ -527,20 +515,8 @@
             <w:hideMark/>
           </w:tcPr>
           <w:p>
-            <w:pPr>
-              <w:jc w:val="center"/>
-              <w:spacing w:before="0" w:after="0" w:line="240" w:lineRule="auto"/>
-            </w:pPr>
-            <w:r>
-              <w:rPr>
-                <w:rFonts w:ascii="Malgun Gothic" w:hAnsi="Malgun Gothic" w:eastAsia="맑은 고딕"/>
-                <w:b/>
-                <w:bCs/>
-                <w:color w:val="000000"/>
-                <w:sz w:val="20"/>
-                <w:szCs w:val="20"/>
-              </w:rPr>
-              <w:t>제출 전 접수정보 확인 필요</w:t>
+            <w:r>
+              <w:t>일반</w:t>
             </w:r>
           </w:p>
         </w:tc>
@@ -603,20 +579,8 @@
             <w:hideMark/>
           </w:tcPr>
           <w:p>
-            <w:pPr>
-              <w:jc w:val="center"/>
-              <w:spacing w:before="0" w:after="0" w:line="240" w:lineRule="auto"/>
-            </w:pPr>
-            <w:r>
-              <w:rPr>
-                <w:rFonts w:ascii="Malgun Gothic" w:hAnsi="Malgun Gothic" w:eastAsia="맑은 고딕"/>
-                <w:b/>
-                <w:bCs/>
-                <w:color w:val="000000"/>
-                <w:sz w:val="20"/>
-                <w:szCs w:val="20"/>
-              </w:rPr>
-              <w:t>제출 전 접수정보 확인 필요</w:t>
+            <w:r>
+              <w:t>자유과제</w:t>
             </w:r>
           </w:p>
         </w:tc>
@@ -865,20 +829,8 @@
             <w:vAlign w:val="top"/>
           </w:tcPr>
           <w:p>
-            <w:pPr>
-              <w:jc w:val="left"/>
-              <w:spacing w:before="0" w:after="40" w:line="276" w:lineRule="auto"/>
-            </w:pPr>
-            <w:r>
-              <w:rPr>
-                <w:rFonts w:ascii="Malgun Gothic" w:hAnsi="Malgun Gothic" w:eastAsia="맑은 고딕"/>
-                <w:b/>
-                <w:bCs/>
-                <w:color w:val="000000"/>
-                <w:sz w:val="20"/>
-                <w:szCs w:val="20"/>
-              </w:rPr>
-              <w:t>미확정 - 공개 저장소를 아직 게시하지 않음. 제출 전 실제 GitHub URL 입력 및 접속 검증 필요</w:t>
+            <w:r>
+              <w:t>https://github.com/chappse6/web-picker</w:t>
             </w:r>
           </w:p>
         </w:tc>
@@ -943,20 +895,8 @@
             <w:vAlign w:val="top"/>
           </w:tcPr>
           <w:p>
-            <w:pPr>
-              <w:jc w:val="left"/>
-              <w:spacing w:before="0" w:after="40" w:line="276" w:lineRule="auto"/>
-            </w:pPr>
-            <w:r>
-              <w:rPr>
-                <w:rFonts w:ascii="Malgun Gothic" w:hAnsi="Malgun Gothic" w:eastAsia="맑은 고딕"/>
-                <w:b/>
-                <w:bCs/>
-                <w:color w:val="000000"/>
-                <w:sz w:val="20"/>
-                <w:szCs w:val="20"/>
-              </w:rPr>
-              <w:t>미확정 - 최종 시연 영상을 아직 업로드하지 않음. 제출 전 3분 이하 YouTube URL 입력 및 재생 검증 필요</w:t>
+            <w:r>
+              <w:t>https://youtu.be/ZYcI42mq5YM</w:t>
             </w:r>
           </w:p>
         </w:tc>

</xml_diff>

<commit_message>
docs: update contest report cover fields
Set required cover table fields:
- 팀인원: 1
- 참가부문: 일반
- 과제유형: 자유과제

Regenerated PDF from updated DOCX.
URLs and SBOM remain unchanged (already set in PR #6).

Co-authored-by: Seeun Park <chappse6@users.noreply.github.com>
</commit_message>
<xml_diff>
--- a/artifacts/web-picker-result-report.docx
+++ b/artifacts/web-picker-result-report.docx
@@ -447,20 +447,8 @@
             <w:hideMark/>
           </w:tcPr>
           <w:p>
-            <w:pPr>
-              <w:jc w:val="center"/>
-              <w:spacing w:before="0" w:after="0" w:line="240" w:lineRule="auto"/>
-            </w:pPr>
-            <w:r>
-              <w:rPr>
-                <w:rFonts w:ascii="Malgun Gothic" w:hAnsi="Malgun Gothic" w:eastAsia="맑은 고딕"/>
-                <w:b/>
-                <w:bCs/>
-                <w:color w:val="000000"/>
-                <w:sz w:val="20"/>
-                <w:szCs w:val="20"/>
-              </w:rPr>
-              <w:t>제출 전 접수정보 확인 필요</w:t>
+            <w:r>
+              <w:t>1</w:t>
             </w:r>
           </w:p>
         </w:tc>
@@ -527,20 +515,8 @@
             <w:hideMark/>
           </w:tcPr>
           <w:p>
-            <w:pPr>
-              <w:jc w:val="center"/>
-              <w:spacing w:before="0" w:after="0" w:line="240" w:lineRule="auto"/>
-            </w:pPr>
-            <w:r>
-              <w:rPr>
-                <w:rFonts w:ascii="Malgun Gothic" w:hAnsi="Malgun Gothic" w:eastAsia="맑은 고딕"/>
-                <w:b/>
-                <w:bCs/>
-                <w:color w:val="000000"/>
-                <w:sz w:val="20"/>
-                <w:szCs w:val="20"/>
-              </w:rPr>
-              <w:t>제출 전 접수정보 확인 필요</w:t>
+            <w:r>
+              <w:t>일반</w:t>
             </w:r>
           </w:p>
         </w:tc>
@@ -603,20 +579,8 @@
             <w:hideMark/>
           </w:tcPr>
           <w:p>
-            <w:pPr>
-              <w:jc w:val="center"/>
-              <w:spacing w:before="0" w:after="0" w:line="240" w:lineRule="auto"/>
-            </w:pPr>
-            <w:r>
-              <w:rPr>
-                <w:rFonts w:ascii="Malgun Gothic" w:hAnsi="Malgun Gothic" w:eastAsia="맑은 고딕"/>
-                <w:b/>
-                <w:bCs/>
-                <w:color w:val="000000"/>
-                <w:sz w:val="20"/>
-                <w:szCs w:val="20"/>
-              </w:rPr>
-              <w:t>제출 전 접수정보 확인 필요</w:t>
+            <w:r>
+              <w:t>자유과제</w:t>
             </w:r>
           </w:p>
         </w:tc>

</xml_diff>